<commit_message>
Put the slide description next to the words it accompanies
The scripts listed slide contents in a table on a separate page, which is where
you cannot read it — during a take you are looking at one block at a time. Each
timing block now carries what is on screen, why that slide exists, and the
narration together.
</commit_message>
<xml_diff>
--- a/Genome-Firewall-Demo-Script.docx
+++ b/Genome-Firewall-Demo-Script.docx
@@ -9,27 +9,26 @@
       <w:r>
         <w:rPr>
           <w:b/>
-          <w:color w:val="1A1A1A"/>
-          <w:sz w:val="42"/>
+          <w:sz w:val="40"/>
         </w:rPr>
         <w:t>Demo Video — Recording Script</w:t>
       </w:r>
     </w:p>
     <w:p>
       <w:pPr>
-        <w:spacing w:after="280"/>
+        <w:spacing w:after="260"/>
       </w:pPr>
       <w:r>
         <w:rPr>
-          <w:color w:val="5A5A5A"/>
-          <w:sz w:val="21"/>
+          <w:color w:val="5B6166"/>
+          <w:sz w:val="20"/>
         </w:rPr>
         <w:t>Genome Firewall · Hack-Nation Challenge 6 · 60 seconds · screen recording, no slides</w:t>
       </w:r>
     </w:p>
     <w:p>
       <w:pPr>
-        <w:spacing w:before="260" w:after="100"/>
+        <w:spacing w:before="80" w:after="100"/>
       </w:pPr>
       <w:r>
         <w:rPr>
@@ -37,7 +36,7 @@
           <w:color w:val="059669"/>
           <w:sz w:val="25"/>
         </w:rPr>
-        <w:t>Before you record</w:t>
+        <w:t>Setup</w:t>
       </w:r>
     </w:p>
     <w:p>
@@ -47,7 +46,7 @@
       </w:pPr>
       <w:r>
         <w:rPr>
-          <w:color w:val="1A1A1A"/>
+          <w:color w:val="141618"/>
           <w:sz w:val="20"/>
         </w:rPr>
         <w:t>No slides in this video. The brief says show the project in action — slides dilute that.</w:t>
@@ -60,10 +59,10 @@
       </w:pPr>
       <w:r>
         <w:rPr>
-          <w:color w:val="1A1A1A"/>
+          <w:color w:val="141618"/>
           <w:sz w:val="20"/>
         </w:rPr>
-        <w:t>Start the dev server and load every page once first, so nothing compiles on camera.</w:t>
+        <w:t>Start the dev server and visit every page once before recording, so nothing compiles on camera.</w:t>
       </w:r>
     </w:p>
     <w:p>
@@ -73,10 +72,10 @@
       </w:pPr>
       <w:r>
         <w:rPr>
-          <w:color w:val="1A1A1A"/>
+          <w:color w:val="141618"/>
           <w:sz w:val="20"/>
         </w:rPr>
-        <w:t>Record at 1440x900 or similar. Browser fullscreen, no bookmarks bar, no notifications.</w:t>
+        <w:t>Browser fullscreen. No bookmarks bar, no notifications, no visible tabs.</w:t>
       </w:r>
     </w:p>
     <w:p>
@@ -86,10 +85,10 @@
       </w:pPr>
       <w:r>
         <w:rPr>
-          <w:color w:val="1A1A1A"/>
+          <w:color w:val="141618"/>
           <w:sz w:val="20"/>
         </w:rPr>
-        <w:t>Inference takes ~1.2 seconds. DO NOT cut it out — that it genuinely runs is the whole point.</w:t>
+        <w:t>Inference takes ~1.2 seconds. DO NOT cut it — that it genuinely runs is the entire point.</w:t>
       </w:r>
     </w:p>
     <w:p>
@@ -99,10 +98,10 @@
       </w:pPr>
       <w:r>
         <w:rPr>
-          <w:color w:val="1A1A1A"/>
+          <w:color w:val="141618"/>
           <w:sz w:val="20"/>
         </w:rPr>
-        <w:t>Rehearse once end to end. It fits in 60s with room to spare.</w:t>
+        <w:t>Rehearse once end to end before recording. It fits in 60 seconds with room to spare.</w:t>
       </w:r>
     </w:p>
     <w:p>
@@ -112,7 +111,7 @@
       </w:pPr>
       <w:r>
         <w:rPr>
-          <w:color w:val="1A1A1A"/>
+          <w:color w:val="141618"/>
           <w:sz w:val="20"/>
         </w:rPr>
         <w:t>If you must cut something, cut 0:08–0:16.</w:t>
@@ -120,36 +119,39 @@
     </w:p>
     <w:p>
       <w:pPr>
-        <w:spacing w:before="260" w:after="100"/>
+        <w:spacing w:before="280" w:after="100"/>
       </w:pPr>
       <w:r>
         <w:rPr>
           <w:b/>
-          <w:color w:val="1A1A1A"/>
+          <w:color w:val="141618"/>
           <w:sz w:val="25"/>
         </w:rPr>
         <w:t>The one thing that matters</w:t>
       </w:r>
     </w:p>
     <w:p>
+      <w:pPr>
+        <w:spacing w:after="120"/>
+      </w:pPr>
       <w:r>
         <w:rPr>
           <w:b w:val="0"/>
           <w:i w:val="0"/>
-          <w:color w:val="1A1A1A"/>
+          <w:color w:val="141618"/>
           <w:sz w:val="21"/>
         </w:rPr>
-        <w:t>Every other team will demo a confident prediction. The moment judges remember is the system refusing to answer. Say the word "refuses" clearly and let the deferred results sit on screen for a full two seconds before moving on.</w:t>
+        <w:t>Every other team will demo a confident prediction. The moment judges remember is the system refusing to answer. Say the word “refuses” clearly, and let the deferred results sit on screen for a full two seconds before you move on.</w:t>
       </w:r>
     </w:p>
     <w:p>
       <w:pPr>
-        <w:spacing w:before="260" w:after="100"/>
+        <w:spacing w:before="280" w:after="100"/>
       </w:pPr>
       <w:r>
         <w:rPr>
           <w:b/>
-          <w:color w:val="1A1A1A"/>
+          <w:color w:val="141618"/>
           <w:sz w:val="25"/>
         </w:rPr>
         <w:t>Script</w:t>
@@ -157,249 +159,546 @@
     </w:p>
     <w:p>
       <w:pPr>
-        <w:spacing w:before="220" w:after="20"/>
+        <w:spacing w:before="300" w:after="60"/>
+        <w:shd w:val="clear" w:fill="F0F4F2"/>
       </w:pPr>
       <w:r>
         <w:rPr>
           <w:b/>
           <w:color w:val="059669"/>
-          <w:sz w:val="19"/>
+          <w:sz w:val="22"/>
         </w:rPr>
-        <w:t xml:space="preserve">0:00–0:08   </w:t>
+        <w:t xml:space="preserve">  0:00–0:08   </w:t>
       </w:r>
       <w:r>
         <w:rPr>
-          <w:color w:val="5A5A5A"/>
-          <w:sz w:val="19"/>
+          <w:b/>
+          <w:color w:val="141618"/>
+          <w:sz w:val="22"/>
         </w:rPr>
-        <w:t>Worklist page. Cursor moves slowly down the queue.</w:t>
+        <w:t xml:space="preserve">Worklist page (/). Cursor drifts slowly down the queue — do not click yet.  </w:t>
       </w:r>
     </w:p>
     <w:p>
       <w:pPr>
-        <w:spacing w:before="80" w:after="180" w:line="341" w:lineRule="auto"/>
-        <w:ind w:left="317"/>
+        <w:spacing w:before="140" w:after="40"/>
+        <w:ind w:left="288"/>
       </w:pPr>
       <w:r>
         <w:rPr>
-          <w:color w:val="1A1A1A"/>
-          <w:sz w:val="26"/>
+          <w:b/>
+          <w:color w:val="8B9297"/>
+          <w:sz w:val="17"/>
+        </w:rPr>
+        <w:t>ON SCREEN</w:t>
+      </w:r>
+    </w:p>
+    <w:p>
+      <w:pPr>
+        <w:spacing w:after="60" w:line="307" w:lineRule="auto"/>
+        <w:ind w:left="288"/>
+      </w:pPr>
+      <w:r>
+        <w:rPr>
+          <w:color w:val="5B6166"/>
+          <w:sz w:val="19"/>
+        </w:rPr>
+        <w:t>Sixteen specimens in a clinical table: accession, organism, source, ward, status, therapy options, time received. This reads as a laboratory system, not a dashboard.</w:t>
+      </w:r>
+    </w:p>
+    <w:p>
+      <w:pPr>
+        <w:spacing w:before="140" w:after="40"/>
+        <w:ind w:left="288"/>
+      </w:pPr>
+      <w:r>
+        <w:rPr>
+          <w:b/>
+          <w:color w:val="059669"/>
+          <w:sz w:val="17"/>
+        </w:rPr>
+        <w:t>SAY</w:t>
+      </w:r>
+    </w:p>
+    <w:p>
+      <w:pPr>
+        <w:spacing w:after="80" w:line="336" w:lineRule="auto"/>
+        <w:ind w:left="288"/>
+      </w:pPr>
+      <w:r>
+        <w:rPr>
+          <w:sz w:val="27"/>
         </w:rPr>
         <w:t>This is a hospital microbiology worklist — sixteen isolates, each one a patient waiting on susceptibility results.</w:t>
       </w:r>
     </w:p>
     <w:p>
       <w:pPr>
-        <w:spacing w:before="220" w:after="20"/>
+        <w:spacing w:before="300" w:after="60"/>
+        <w:shd w:val="clear" w:fill="F0F4F2"/>
       </w:pPr>
       <w:r>
         <w:rPr>
           <w:b/>
           <w:color w:val="059669"/>
-          <w:sz w:val="19"/>
+          <w:sz w:val="22"/>
         </w:rPr>
-        <w:t xml:space="preserve">0:08–0:16   </w:t>
+        <w:t xml:space="preserve">  0:08–0:16   </w:t>
       </w:r>
       <w:r>
         <w:rPr>
-          <w:color w:val="5A5A5A"/>
-          <w:sz w:val="19"/>
+          <w:b/>
+          <w:color w:val="141618"/>
+          <w:sz w:val="22"/>
         </w:rPr>
-        <w:t>Click any specimen with resistant calls. Panel loads.</w:t>
+        <w:t xml:space="preserve">Click any row with resistant calls. Specimen page loads.  </w:t>
       </w:r>
     </w:p>
     <w:p>
       <w:pPr>
-        <w:spacing w:before="80" w:after="180" w:line="341" w:lineRule="auto"/>
-        <w:ind w:left="317"/>
+        <w:spacing w:before="140" w:after="40"/>
+        <w:ind w:left="288"/>
       </w:pPr>
       <w:r>
         <w:rPr>
-          <w:color w:val="1A1A1A"/>
-          <w:sz w:val="26"/>
+          <w:b/>
+          <w:color w:val="8B9297"/>
+          <w:sz w:val="17"/>
+        </w:rPr>
+        <w:t>ON SCREEN</w:t>
+      </w:r>
+    </w:p>
+    <w:p>
+      <w:pPr>
+        <w:spacing w:after="60" w:line="307" w:lineRule="auto"/>
+        <w:ind w:left="288"/>
+      </w:pPr>
+      <w:r>
+        <w:rPr>
+          <w:color w:val="5B6166"/>
+          <w:sz w:val="19"/>
+        </w:rPr>
+        <w:t>Full antibiotic panel, sorted susceptible first, then deferred, then resistant. Each row carries a call chip, a confidence meter and a probability.</w:t>
+      </w:r>
+    </w:p>
+    <w:p>
+      <w:pPr>
+        <w:spacing w:before="140" w:after="40"/>
+        <w:ind w:left="288"/>
+      </w:pPr>
+      <w:r>
+        <w:rPr>
+          <w:b/>
+          <w:color w:val="059669"/>
+          <w:sz w:val="17"/>
+        </w:rPr>
+        <w:t>SAY</w:t>
+      </w:r>
+    </w:p>
+    <w:p>
+      <w:pPr>
+        <w:spacing w:after="80" w:line="336" w:lineRule="auto"/>
+        <w:ind w:left="288"/>
+      </w:pPr>
+      <w:r>
+        <w:rPr>
+          <w:sz w:val="27"/>
         </w:rPr>
         <w:t>Opening one gives the full antibiotic panel, susceptible agents first, so what you read first is what you can actually prescribe.</w:t>
       </w:r>
     </w:p>
     <w:p>
       <w:pPr>
-        <w:spacing w:before="220" w:after="20"/>
+        <w:spacing w:before="300" w:after="60"/>
+        <w:shd w:val="clear" w:fill="F0F4F2"/>
       </w:pPr>
       <w:r>
         <w:rPr>
           <w:b/>
           <w:color w:val="059669"/>
-          <w:sz w:val="19"/>
+          <w:sz w:val="22"/>
         </w:rPr>
-        <w:t xml:space="preserve">0:16–0:28   </w:t>
+        <w:t xml:space="preserve">  0:16–0:28   </w:t>
       </w:r>
       <w:r>
         <w:rPr>
-          <w:color w:val="5A5A5A"/>
-          <w:sz w:val="19"/>
+          <w:b/>
+          <w:color w:val="141618"/>
+          <w:sz w:val="22"/>
         </w:rPr>
-        <w:t>Click one antibiotic. Dialog opens over the panel.</w:t>
+        <w:t xml:space="preserve">Click one antibiotic row. Centred dialog opens over the panel.  </w:t>
       </w:r>
     </w:p>
     <w:p>
       <w:pPr>
-        <w:spacing w:before="80" w:after="180" w:line="341" w:lineRule="auto"/>
-        <w:ind w:left="317"/>
+        <w:spacing w:before="140" w:after="40"/>
+        <w:ind w:left="288"/>
       </w:pPr>
       <w:r>
         <w:rPr>
-          <w:color w:val="1A1A1A"/>
-          <w:sz w:val="26"/>
+          <w:b/>
+          <w:color w:val="8B9297"/>
+          <w:sz w:val="17"/>
+        </w:rPr>
+        <w:t>ON SCREEN</w:t>
+      </w:r>
+    </w:p>
+    <w:p>
+      <w:pPr>
+        <w:spacing w:after="60" w:line="307" w:lineRule="auto"/>
+        <w:ind w:left="288"/>
+      </w:pPr>
+      <w:r>
+        <w:rPr>
+          <w:color w:val="5B6166"/>
+          <w:sz w:val="19"/>
+        </w:rPr>
+        <w:t>Evidence view: contributing determinants with signed contributions, the driver named, and where relevant a flag that a rule-based method would miss this.</w:t>
+      </w:r>
+    </w:p>
+    <w:p>
+      <w:pPr>
+        <w:spacing w:before="140" w:after="40"/>
+        <w:ind w:left="288"/>
+      </w:pPr>
+      <w:r>
+        <w:rPr>
+          <w:b/>
+          <w:color w:val="059669"/>
+          <w:sz w:val="17"/>
+        </w:rPr>
+        <w:t>SAY</w:t>
+      </w:r>
+    </w:p>
+    <w:p>
+      <w:pPr>
+        <w:spacing w:after="80" w:line="336" w:lineRule="auto"/>
+        <w:ind w:left="288"/>
+      </w:pPr>
+      <w:r>
+        <w:rPr>
+          <w:sz w:val="27"/>
         </w:rPr>
         <w:t>Every call opens to its evidence. This one is carried by a chromosomal mutation — and that matters, because gene-lookup tools screen for acquired genes only. They report this isolate susceptible. It is not.</w:t>
       </w:r>
     </w:p>
     <w:p>
       <w:pPr>
-        <w:spacing w:before="220" w:after="20"/>
+        <w:spacing w:before="300" w:after="60"/>
+        <w:shd w:val="clear" w:fill="F0F4F2"/>
       </w:pPr>
       <w:r>
         <w:rPr>
           <w:b/>
           <w:color w:val="059669"/>
-          <w:sz w:val="19"/>
+          <w:sz w:val="22"/>
         </w:rPr>
-        <w:t xml:space="preserve">0:28–0:38   </w:t>
+        <w:t xml:space="preserve">  0:28–0:38   </w:t>
       </w:r>
       <w:r>
         <w:rPr>
-          <w:color w:val="5A5A5A"/>
-          <w:sz w:val="19"/>
+          <w:b/>
+          <w:color w:val="141618"/>
+          <w:sz w:val="22"/>
         </w:rPr>
-        <w:t>Navigate to New analysis. Click 'Unfamiliar machinery'. LET IT RUN.</w:t>
+        <w:t xml:space="preserve">Navigate to New analysis. Click “Unfamiliar machinery”. LET IT RUN.  </w:t>
       </w:r>
     </w:p>
     <w:p>
       <w:pPr>
-        <w:spacing w:before="80" w:after="180" w:line="341" w:lineRule="auto"/>
-        <w:ind w:left="317"/>
+        <w:spacing w:before="140" w:after="40"/>
+        <w:ind w:left="288"/>
       </w:pPr>
       <w:r>
         <w:rPr>
-          <w:color w:val="1A1A1A"/>
-          <w:sz w:val="26"/>
+          <w:b/>
+          <w:color w:val="8B9297"/>
+          <w:sz w:val="17"/>
+        </w:rPr>
+        <w:t>ON SCREEN</w:t>
+      </w:r>
+    </w:p>
+    <w:p>
+      <w:pPr>
+        <w:spacing w:after="60" w:line="307" w:lineRule="auto"/>
+        <w:ind w:left="288"/>
+      </w:pPr>
+      <w:r>
+        <w:rPr>
+          <w:color w:val="5B6166"/>
+          <w:sz w:val="19"/>
+        </w:rPr>
+        <w:t>The four-step stepper works through reading the profile, normalising annotations, scoring each antibiotic, applying safety gates. This takes about 1.2 seconds and it is real.</w:t>
+      </w:r>
+    </w:p>
+    <w:p>
+      <w:pPr>
+        <w:spacing w:before="140" w:after="40"/>
+        <w:ind w:left="288"/>
+      </w:pPr>
+      <w:r>
+        <w:rPr>
+          <w:b/>
+          <w:color w:val="059669"/>
+          <w:sz w:val="17"/>
+        </w:rPr>
+        <w:t>SAY</w:t>
+      </w:r>
+    </w:p>
+    <w:p>
+      <w:pPr>
+        <w:spacing w:after="80" w:line="336" w:lineRule="auto"/>
+        <w:ind w:left="288"/>
+      </w:pPr>
+      <w:r>
+        <w:rPr>
+          <w:sz w:val="27"/>
         </w:rPr>
         <w:t>Now a genome the system has never seen, carrying resistance machinery absent from training.</w:t>
       </w:r>
     </w:p>
     <w:p>
       <w:pPr>
-        <w:spacing w:before="220" w:after="20"/>
+        <w:spacing w:before="300" w:after="60"/>
+        <w:shd w:val="clear" w:fill="F0F4F2"/>
       </w:pPr>
       <w:r>
         <w:rPr>
           <w:b/>
           <w:color w:val="059669"/>
-          <w:sz w:val="19"/>
+          <w:sz w:val="22"/>
         </w:rPr>
-        <w:t xml:space="preserve">0:38–0:48   </w:t>
+        <w:t xml:space="preserve">  0:38–0:48   </w:t>
       </w:r>
       <w:r>
         <w:rPr>
-          <w:color w:val="5A5A5A"/>
-          <w:sz w:val="19"/>
+          <w:b/>
+          <w:color w:val="141618"/>
+          <w:sz w:val="22"/>
         </w:rPr>
-        <w:t>Results land: all ten deferred. Pause on them.</w:t>
+        <w:t xml:space="preserve">Results land — all ten deferred. HOLD for a full two seconds.  </w:t>
       </w:r>
     </w:p>
     <w:p>
       <w:pPr>
-        <w:spacing w:before="80" w:after="180" w:line="341" w:lineRule="auto"/>
-        <w:ind w:left="317"/>
+        <w:spacing w:before="140" w:after="40"/>
+        <w:ind w:left="288"/>
       </w:pPr>
       <w:r>
         <w:rPr>
-          <w:color w:val="1A1A1A"/>
-          <w:sz w:val="26"/>
+          <w:b/>
+          <w:color w:val="8B9297"/>
+          <w:sz w:val="17"/>
+        </w:rPr>
+        <w:t>ON SCREEN</w:t>
+      </w:r>
+    </w:p>
+    <w:p>
+      <w:pPr>
+        <w:spacing w:after="60" w:line="307" w:lineRule="auto"/>
+        <w:ind w:left="288"/>
+      </w:pPr>
+      <w:r>
+        <w:rPr>
+          <w:color w:val="5B6166"/>
+          <w:sz w:val="19"/>
+        </w:rPr>
+        <w:t>Therapy options reads “None — no agent clears the safety gates. Escalate to culture.” Every drug shows Deferred with its reason. Sidebar lists the unfamiliar determinant.</w:t>
+      </w:r>
+    </w:p>
+    <w:p>
+      <w:pPr>
+        <w:spacing w:before="140" w:after="40"/>
+        <w:ind w:left="288"/>
+      </w:pPr>
+      <w:r>
+        <w:rPr>
+          <w:b/>
+          <w:color w:val="059669"/>
+          <w:sz w:val="17"/>
+        </w:rPr>
+        <w:t>SAY</w:t>
+      </w:r>
+    </w:p>
+    <w:p>
+      <w:pPr>
+        <w:spacing w:after="80" w:line="336" w:lineRule="auto"/>
+        <w:ind w:left="288"/>
+      </w:pPr>
+      <w:r>
+        <w:rPr>
+          <w:sz w:val="27"/>
         </w:rPr>
         <w:t>It refuses. All ten antibiotics deferred to culture — because the model cannot score machinery it does not recognise, and a confident wrong answer is what kills the patient.</w:t>
       </w:r>
     </w:p>
     <w:p>
       <w:pPr>
-        <w:spacing w:before="220" w:after="20"/>
+        <w:spacing w:before="300" w:after="60"/>
+        <w:shd w:val="clear" w:fill="F0F4F2"/>
       </w:pPr>
       <w:r>
         <w:rPr>
           <w:b/>
           <w:color w:val="059669"/>
-          <w:sz w:val="19"/>
+          <w:sz w:val="22"/>
         </w:rPr>
-        <w:t xml:space="preserve">0:48–0:56   </w:t>
+        <w:t xml:space="preserve">  0:48–0:56   </w:t>
       </w:r>
       <w:r>
         <w:rPr>
-          <w:color w:val="5A5A5A"/>
-          <w:sz w:val="19"/>
+          <w:b/>
+          <w:color w:val="141618"/>
+          <w:sz w:val="22"/>
         </w:rPr>
-        <w:t>Click 'Lightly armed isolate'. LET IT RUN.</w:t>
+        <w:t xml:space="preserve">Click “Lightly armed isolate”. LET IT RUN.  </w:t>
       </w:r>
     </w:p>
     <w:p>
       <w:pPr>
-        <w:spacing w:before="80" w:after="180" w:line="341" w:lineRule="auto"/>
-        <w:ind w:left="317"/>
+        <w:spacing w:before="140" w:after="40"/>
+        <w:ind w:left="288"/>
       </w:pPr>
       <w:r>
         <w:rPr>
-          <w:color w:val="1A1A1A"/>
-          <w:sz w:val="26"/>
+          <w:b/>
+          <w:color w:val="8B9297"/>
+          <w:sz w:val="17"/>
+        </w:rPr>
+        <w:t>ON SCREEN</w:t>
+      </w:r>
+    </w:p>
+    <w:p>
+      <w:pPr>
+        <w:spacing w:after="60" w:line="307" w:lineRule="auto"/>
+        <w:ind w:left="288"/>
+      </w:pPr>
+      <w:r>
+        <w:rPr>
+          <w:color w:val="5B6166"/>
+          <w:sz w:val="19"/>
+        </w:rPr>
+        <w:t>Same pipeline, different outcome: seven agents come back susceptible and appear as green chips under Therapy options reported.</w:t>
+      </w:r>
+    </w:p>
+    <w:p>
+      <w:pPr>
+        <w:spacing w:before="140" w:after="40"/>
+        <w:ind w:left="288"/>
+      </w:pPr>
+      <w:r>
+        <w:rPr>
+          <w:b/>
+          <w:color w:val="059669"/>
+          <w:sz w:val="17"/>
+        </w:rPr>
+        <w:t>SAY</w:t>
+      </w:r>
+    </w:p>
+    <w:p>
+      <w:pPr>
+        <w:spacing w:after="80" w:line="336" w:lineRule="auto"/>
+        <w:ind w:left="288"/>
+      </w:pPr>
+      <w:r>
+        <w:rPr>
+          <w:sz w:val="27"/>
         </w:rPr>
         <w:t>And when the evidence is there, it commits. Seven agents cleared for therapy, in about a second.</w:t>
       </w:r>
     </w:p>
     <w:p>
       <w:pPr>
-        <w:spacing w:before="220" w:after="20"/>
+        <w:spacing w:before="300" w:after="60"/>
+        <w:shd w:val="clear" w:fill="F0F4F2"/>
       </w:pPr>
       <w:r>
         <w:rPr>
           <w:b/>
           <w:color w:val="059669"/>
-          <w:sz w:val="19"/>
+          <w:sz w:val="22"/>
         </w:rPr>
-        <w:t xml:space="preserve">0:56–1:00   </w:t>
+        <w:t xml:space="preserve">  0:56–1:00   </w:t>
       </w:r>
       <w:r>
         <w:rPr>
-          <w:color w:val="5A5A5A"/>
-          <w:sz w:val="19"/>
+          <w:b/>
+          <w:color w:val="141618"/>
+          <w:sz w:val="22"/>
         </w:rPr>
-        <w:t>Hold on the result. Fade.</w:t>
+        <w:t xml:space="preserve">Hold on the result. Fade out.  </w:t>
       </w:r>
     </w:p>
     <w:p>
       <w:pPr>
-        <w:spacing w:before="80" w:after="180" w:line="341" w:lineRule="auto"/>
-        <w:ind w:left="317"/>
+        <w:spacing w:before="140" w:after="40"/>
+        <w:ind w:left="288"/>
       </w:pPr>
       <w:r>
         <w:rPr>
-          <w:color w:val="1A1A1A"/>
-          <w:sz w:val="26"/>
+          <w:b/>
+          <w:color w:val="8B9297"/>
+          <w:sz w:val="17"/>
+        </w:rPr>
+        <w:t>ON SCREEN</w:t>
+      </w:r>
+    </w:p>
+    <w:p>
+      <w:pPr>
+        <w:spacing w:after="60" w:line="307" w:lineRule="auto"/>
+        <w:ind w:left="288"/>
+      </w:pPr>
+      <w:r>
+        <w:rPr>
+          <w:color w:val="5B6166"/>
+          <w:sz w:val="19"/>
+        </w:rPr>
+        <w:t>Elapsed time and determinant counts are visible under the stepper — proof the run just happened rather than being loaded from a table.</w:t>
+      </w:r>
+    </w:p>
+    <w:p>
+      <w:pPr>
+        <w:spacing w:before="140" w:after="40"/>
+        <w:ind w:left="288"/>
+      </w:pPr>
+      <w:r>
+        <w:rPr>
+          <w:b/>
+          <w:color w:val="059669"/>
+          <w:sz w:val="17"/>
+        </w:rPr>
+        <w:t>SAY</w:t>
+      </w:r>
+    </w:p>
+    <w:p>
+      <w:pPr>
+        <w:spacing w:after="80" w:line="336" w:lineRule="auto"/>
+        <w:ind w:left="288"/>
+      </w:pPr>
+      <w:r>
+        <w:rPr>
+          <w:sz w:val="27"/>
         </w:rPr>
         <w:t>Real model, real inference, on an isolate held out of training.</w:t>
       </w:r>
     </w:p>
     <w:p>
+      <w:pPr>
+        <w:spacing w:after="40"/>
+      </w:pPr>
       <w:r>
         <w:rPr>
           <w:b w:val="0"/>
           <w:i/>
-          <w:color w:val="5A5A5A"/>
+          <w:color w:val="5B6166"/>
           <w:sz w:val="19"/>
         </w:rPr>
-        <w:t>Total: 143 words ≈ 57 seconds spoken, leaving room for the pauses while inference runs.</w:t>
+        <w:t>Total spoken: 143 words ≈ 57 seconds, leaving room for the pauses while inference runs.</w:t>
       </w:r>
     </w:p>
     <w:p>
       <w:pPr>
-        <w:spacing w:before="260" w:after="100"/>
+        <w:spacing w:before="280" w:after="100"/>
       </w:pPr>
       <w:r>
         <w:rPr>
@@ -411,11 +710,14 @@
       </w:r>
     </w:p>
     <w:p>
+      <w:pPr>
+        <w:spacing w:after="120"/>
+      </w:pPr>
       <w:r>
         <w:rPr>
           <w:b w:val="0"/>
           <w:i w:val="0"/>
-          <w:color w:val="5A5A5A"/>
+          <w:color w:val="5B6166"/>
           <w:sz w:val="19"/>
         </w:rPr>
         <w:t>All five are real isolates quarantined from training and absent from the shipped caseload. Each was verified to produce the behaviour its name claims.</w:t>
@@ -425,17 +727,16 @@
       <w:tblPr>
         <w:tblStyle w:val="LightGrid-Accent1"/>
         <w:tblW w:type="auto" w:w="0"/>
-        <w:jc w:val="left"/>
         <w:tblLook w:firstColumn="1" w:firstRow="1" w:lastColumn="0" w:lastRow="0" w:noHBand="0" w:noVBand="1" w:val="04A0"/>
       </w:tblPr>
       <w:tblGrid>
-        <w:gridCol w:w="4968"/>
-        <w:gridCol w:w="4968"/>
+        <w:gridCol w:w="5040"/>
+        <w:gridCol w:w="5040"/>
       </w:tblGrid>
       <w:tr>
         <w:tc>
           <w:tcPr>
-            <w:tcW w:type="dxa" w:w="3024"/>
+            <w:tcW w:type="dxa" w:w="2880"/>
           </w:tcPr>
           <w:p>
             <w:r/>
@@ -467,7 +768,7 @@
       <w:tr>
         <w:tc>
           <w:tcPr>
-            <w:tcW w:type="dxa" w:w="3024"/>
+            <w:tcW w:type="dxa" w:w="2880"/>
           </w:tcPr>
           <w:p>
             <w:r/>
@@ -497,7 +798,7 @@
       <w:tr>
         <w:tc>
           <w:tcPr>
-            <w:tcW w:type="dxa" w:w="3024"/>
+            <w:tcW w:type="dxa" w:w="2880"/>
           </w:tcPr>
           <w:p>
             <w:r/>
@@ -527,7 +828,7 @@
       <w:tr>
         <w:tc>
           <w:tcPr>
-            <w:tcW w:type="dxa" w:w="3024"/>
+            <w:tcW w:type="dxa" w:w="2880"/>
           </w:tcPr>
           <w:p>
             <w:r/>
@@ -557,7 +858,7 @@
       <w:tr>
         <w:tc>
           <w:tcPr>
-            <w:tcW w:type="dxa" w:w="3024"/>
+            <w:tcW w:type="dxa" w:w="2880"/>
           </w:tcPr>
           <w:p>
             <w:r/>
@@ -587,7 +888,7 @@
       <w:tr>
         <w:tc>
           <w:tcPr>
-            <w:tcW w:type="dxa" w:w="3024"/>
+            <w:tcW w:type="dxa" w:w="2880"/>
           </w:tcPr>
           <w:p>
             <w:r/>
@@ -617,7 +918,7 @@
     </w:tbl>
     <w:sectPr>
       <w:pgSz w:w="12240" w:h="15840"/>
-      <w:pgMar w:top="1008" w:right="1152" w:bottom="1008" w:left="1152" w:header="720" w:footer="720" w:gutter="0"/>
+      <w:pgMar w:top="936" w:right="1080" w:bottom="936" w:left="1080" w:header="720" w:footer="720" w:gutter="0"/>
       <w:cols w:space="720"/>
       <w:docGrid w:linePitch="360"/>
     </w:sectPr>
@@ -989,11 +1290,11 @@
     <w:qFormat/>
     <w:rsid w:val="00FC693F"/>
     <w:pPr>
-      <w:spacing w:after="140" w:line="283" w:lineRule="auto"/>
+      <w:spacing w:after="120" w:line="278" w:lineRule="auto"/>
     </w:pPr>
     <w:rPr>
       <w:rFonts w:ascii="Helvetica Neue" w:hAnsi="Helvetica Neue"/>
-      <w:color w:val="1A1A1A"/>
+      <w:color w:val="141618"/>
       <w:sz w:val="21"/>
     </w:rPr>
   </w:style>

</xml_diff>